<commit_message>
Karty pracy A. Di Giusto: doprecyzowanie opisu zadań (narzędzie, RMP)
Co-Authored-By: Claude Sonnet 5.5 <noreply@anthropic.com>
Claude-Session: https://claude.ai/code/session_01Tjc2hnwuZeEHHZpW9z6Grg
</commit_message>
<xml_diff>
--- a/karty_pracy_zadanie3/11._Anna_Di_Giusto_Karty_czasu_pracy_09.2026-04.2027.docx
+++ b/karty_pracy_zadanie3/11._Anna_Di_Giusto_Karty_czasu_pracy_09.2026-04.2027.docx
@@ -484,7 +484,7 @@
                 <w:szCs w:val="20"/>
                 <w:rtl w:val="0"/>
               </w:rPr>
-              <w:t xml:space="preserve">Odpowiedzialność za przygotowanie i przeprowadzenie pogłębionych wywiadów z udziałem testowych użytkowników,</w:t>
+              <w:t xml:space="preserve">Przygotowanie i przeprowadzenie pogłębionych wywiadów z udziałem testowych użytkowników,</w:t>
             </w:r>
           </w:p>
           <w:p>
@@ -534,7 +534,7 @@
                 <w:szCs w:val="20"/>
                 <w:rtl w:val="0"/>
               </w:rPr>
-              <w:t xml:space="preserve">Odpowiedzialność za walidację narzędzia,</w:t>
+              <w:t xml:space="preserve">Walidacja narzędzia psychometrycznego pomiaru potrzeb z wykorzystaniem obrazów (w tym porównanie z metodą referencyjną RMP),</w:t>
             </w:r>
           </w:p>
           <w:p>
@@ -559,7 +559,7 @@
                 <w:szCs w:val="20"/>
                 <w:rtl w:val="0"/>
               </w:rPr>
-              <w:t xml:space="preserve">Odpowiedzialność za określenie dodatkowych parametrów obrazów oraz walidację reprezentatywnego modelu systemu.</w:t>
+              <w:t xml:space="preserve">Określanie dodatkowych parametrów obrazów oraz walidacja reprezentatywnego modelu systemu.</w:t>
             </w:r>
           </w:p>
         </w:tc>
@@ -1273,7 +1273,7 @@
                 <w:szCs w:val="20"/>
                 <w:rtl w:val="0"/>
               </w:rPr>
-              <w:t xml:space="preserve">Odpowiedzialność za przygotowanie i przeprowadzenie pogłębionych wywiadów z udziałem testowych użytkowników,</w:t>
+              <w:t xml:space="preserve">Przygotowanie i przeprowadzenie pogłębionych wywiadów z udziałem testowych użytkowników,</w:t>
             </w:r>
           </w:p>
           <w:p>
@@ -1323,7 +1323,7 @@
                 <w:szCs w:val="20"/>
                 <w:rtl w:val="0"/>
               </w:rPr>
-              <w:t xml:space="preserve">Odpowiedzialność za walidację narzędzia,</w:t>
+              <w:t xml:space="preserve">Walidacja narzędzia psychometrycznego pomiaru potrzeb z wykorzystaniem obrazów (w tym porównanie z metodą referencyjną RMP),</w:t>
             </w:r>
           </w:p>
           <w:p>
@@ -1348,7 +1348,7 @@
                 <w:szCs w:val="20"/>
                 <w:rtl w:val="0"/>
               </w:rPr>
-              <w:t xml:space="preserve">Odpowiedzialność za określenie dodatkowych parametrów obrazów oraz walidację reprezentatywnego modelu systemu.</w:t>
+              <w:t xml:space="preserve">Określanie dodatkowych parametrów obrazów oraz walidacja reprezentatywnego modelu systemu.</w:t>
             </w:r>
           </w:p>
         </w:tc>
@@ -2062,7 +2062,7 @@
                 <w:szCs w:val="20"/>
                 <w:rtl w:val="0"/>
               </w:rPr>
-              <w:t xml:space="preserve">Odpowiedzialność za przygotowanie i przeprowadzenie pogłębionych wywiadów z udziałem testowych użytkowników,</w:t>
+              <w:t xml:space="preserve">Przygotowanie i przeprowadzenie pogłębionych wywiadów z udziałem testowych użytkowników,</w:t>
             </w:r>
           </w:p>
           <w:p>
@@ -2112,7 +2112,7 @@
                 <w:szCs w:val="20"/>
                 <w:rtl w:val="0"/>
               </w:rPr>
-              <w:t xml:space="preserve">Odpowiedzialność za walidację narzędzia,</w:t>
+              <w:t xml:space="preserve">Walidacja narzędzia psychometrycznego pomiaru potrzeb z wykorzystaniem obrazów (w tym porównanie z metodą referencyjną RMP),</w:t>
             </w:r>
           </w:p>
           <w:p>
@@ -2137,7 +2137,7 @@
                 <w:szCs w:val="20"/>
                 <w:rtl w:val="0"/>
               </w:rPr>
-              <w:t xml:space="preserve">Odpowiedzialność za określenie dodatkowych parametrów obrazów oraz walidację reprezentatywnego modelu systemu.</w:t>
+              <w:t xml:space="preserve">Określanie dodatkowych parametrów obrazów oraz walidacja reprezentatywnego modelu systemu.</w:t>
             </w:r>
           </w:p>
         </w:tc>
@@ -2851,7 +2851,7 @@
                 <w:szCs w:val="20"/>
                 <w:rtl w:val="0"/>
               </w:rPr>
-              <w:t xml:space="preserve">Odpowiedzialność za przygotowanie i przeprowadzenie pogłębionych wywiadów z udziałem testowych użytkowników,</w:t>
+              <w:t xml:space="preserve">Przygotowanie i przeprowadzenie pogłębionych wywiadów z udziałem testowych użytkowników,</w:t>
             </w:r>
           </w:p>
           <w:p>
@@ -2901,7 +2901,7 @@
                 <w:szCs w:val="20"/>
                 <w:rtl w:val="0"/>
               </w:rPr>
-              <w:t xml:space="preserve">Odpowiedzialność za walidację narzędzia,</w:t>
+              <w:t xml:space="preserve">Walidacja narzędzia psychometrycznego pomiaru potrzeb z wykorzystaniem obrazów (w tym porównanie z metodą referencyjną RMP),</w:t>
             </w:r>
           </w:p>
           <w:p>
@@ -2926,7 +2926,7 @@
                 <w:szCs w:val="20"/>
                 <w:rtl w:val="0"/>
               </w:rPr>
-              <w:t xml:space="preserve">Odpowiedzialność za określenie dodatkowych parametrów obrazów oraz walidację reprezentatywnego modelu systemu.</w:t>
+              <w:t xml:space="preserve">Określanie dodatkowych parametrów obrazów oraz walidacja reprezentatywnego modelu systemu.</w:t>
             </w:r>
           </w:p>
         </w:tc>
@@ -3640,7 +3640,7 @@
                 <w:szCs w:val="20"/>
                 <w:rtl w:val="0"/>
               </w:rPr>
-              <w:t xml:space="preserve">Odpowiedzialność za przygotowanie i przeprowadzenie pogłębionych wywiadów z udziałem testowych użytkowników,</w:t>
+              <w:t xml:space="preserve">Przygotowanie i przeprowadzenie pogłębionych wywiadów z udziałem testowych użytkowników,</w:t>
             </w:r>
           </w:p>
           <w:p>
@@ -3690,7 +3690,7 @@
                 <w:szCs w:val="20"/>
                 <w:rtl w:val="0"/>
               </w:rPr>
-              <w:t xml:space="preserve">Odpowiedzialność za walidację narzędzia,</w:t>
+              <w:t xml:space="preserve">Walidacja narzędzia psychometrycznego pomiaru potrzeb z wykorzystaniem obrazów (w tym porównanie z metodą referencyjną RMP),</w:t>
             </w:r>
           </w:p>
           <w:p>
@@ -3715,7 +3715,7 @@
                 <w:szCs w:val="20"/>
                 <w:rtl w:val="0"/>
               </w:rPr>
-              <w:t xml:space="preserve">Odpowiedzialność za określenie dodatkowych parametrów obrazów oraz walidację reprezentatywnego modelu systemu.</w:t>
+              <w:t xml:space="preserve">Określanie dodatkowych parametrów obrazów oraz walidacja reprezentatywnego modelu systemu.</w:t>
             </w:r>
           </w:p>
         </w:tc>
@@ -4429,7 +4429,7 @@
                 <w:szCs w:val="20"/>
                 <w:rtl w:val="0"/>
               </w:rPr>
-              <w:t xml:space="preserve">Odpowiedzialność za przygotowanie i przeprowadzenie pogłębionych wywiadów z udziałem testowych użytkowników,</w:t>
+              <w:t xml:space="preserve">Przygotowanie i przeprowadzenie pogłębionych wywiadów z udziałem testowych użytkowników,</w:t>
             </w:r>
           </w:p>
           <w:p>
@@ -4479,7 +4479,7 @@
                 <w:szCs w:val="20"/>
                 <w:rtl w:val="0"/>
               </w:rPr>
-              <w:t xml:space="preserve">Odpowiedzialność za walidację narzędzia,</w:t>
+              <w:t xml:space="preserve">Walidacja narzędzia psychometrycznego pomiaru potrzeb z wykorzystaniem obrazów (w tym porównanie z metodą referencyjną RMP),</w:t>
             </w:r>
           </w:p>
           <w:p>
@@ -4504,7 +4504,7 @@
                 <w:szCs w:val="20"/>
                 <w:rtl w:val="0"/>
               </w:rPr>
-              <w:t xml:space="preserve">Odpowiedzialność za określenie dodatkowych parametrów obrazów oraz walidację reprezentatywnego modelu systemu.</w:t>
+              <w:t xml:space="preserve">Określanie dodatkowych parametrów obrazów oraz walidacja reprezentatywnego modelu systemu.</w:t>
             </w:r>
           </w:p>
         </w:tc>
@@ -5218,7 +5218,7 @@
                 <w:szCs w:val="20"/>
                 <w:rtl w:val="0"/>
               </w:rPr>
-              <w:t xml:space="preserve">Odpowiedzialność za przygotowanie i przeprowadzenie pogłębionych wywiadów z udziałem testowych użytkowników,</w:t>
+              <w:t xml:space="preserve">Przygotowanie i przeprowadzenie pogłębionych wywiadów z udziałem testowych użytkowników,</w:t>
             </w:r>
           </w:p>
           <w:p>
@@ -5268,7 +5268,7 @@
                 <w:szCs w:val="20"/>
                 <w:rtl w:val="0"/>
               </w:rPr>
-              <w:t xml:space="preserve">Odpowiedzialność za walidację narzędzia,</w:t>
+              <w:t xml:space="preserve">Walidacja narzędzia psychometrycznego pomiaru potrzeb z wykorzystaniem obrazów (w tym porównanie z metodą referencyjną RMP),</w:t>
             </w:r>
           </w:p>
           <w:p>
@@ -5293,7 +5293,7 @@
                 <w:szCs w:val="20"/>
                 <w:rtl w:val="0"/>
               </w:rPr>
-              <w:t xml:space="preserve">Odpowiedzialność za określenie dodatkowych parametrów obrazów oraz walidację reprezentatywnego modelu systemu.</w:t>
+              <w:t xml:space="preserve">Określanie dodatkowych parametrów obrazów oraz walidacja reprezentatywnego modelu systemu.</w:t>
             </w:r>
           </w:p>
         </w:tc>
@@ -6007,7 +6007,7 @@
                 <w:szCs w:val="20"/>
                 <w:rtl w:val="0"/>
               </w:rPr>
-              <w:t xml:space="preserve">Odpowiedzialność za przygotowanie i przeprowadzenie pogłębionych wywiadów z udziałem testowych użytkowników,</w:t>
+              <w:t xml:space="preserve">Przygotowanie i przeprowadzenie pogłębionych wywiadów z udziałem testowych użytkowników,</w:t>
             </w:r>
           </w:p>
           <w:p>
@@ -6057,7 +6057,7 @@
                 <w:szCs w:val="20"/>
                 <w:rtl w:val="0"/>
               </w:rPr>
-              <w:t xml:space="preserve">Odpowiedzialność za walidację narzędzia,</w:t>
+              <w:t xml:space="preserve">Walidacja narzędzia psychometrycznego pomiaru potrzeb z wykorzystaniem obrazów (w tym porównanie z metodą referencyjną RMP),</w:t>
             </w:r>
           </w:p>
           <w:p>
@@ -6082,7 +6082,7 @@
                 <w:szCs w:val="20"/>
                 <w:rtl w:val="0"/>
               </w:rPr>
-              <w:t xml:space="preserve">Odpowiedzialność za określenie dodatkowych parametrów obrazów oraz walidację reprezentatywnego modelu systemu.</w:t>
+              <w:t xml:space="preserve">Określanie dodatkowych parametrów obrazów oraz walidacja reprezentatywnego modelu systemu.</w:t>
             </w:r>
           </w:p>
         </w:tc>

</xml_diff>

<commit_message>
Karty pracy A. Di Giusto: tabela jak w karcie 09.2026 (czcionka 12, przekreślone prace rozwojowe)
Co-Authored-By: Claude Sonnet 5.5 <noreply@anthropic.com>
Claude-Session: https://claude.ai/code/session_01Tjc2hnwuZeEHHZpW9z6Grg
</commit_message>
<xml_diff>
--- a/karty_pracy_zadanie3/11._Anna_Di_Giusto_Karty_czasu_pracy_09.2026-04.2027.docx
+++ b/karty_pracy_zadanie3/11._Anna_Di_Giusto_Karty_czasu_pracy_09.2026-04.2027.docx
@@ -2033,15 +2033,11 @@
               <w:jc w:val="both"/>
               <w:rPr>
                 <w:rFonts w:ascii="Calibri" w:eastAsia="Calibri" w:hAnsi="Calibri" w:cs="Calibri"/>
-                <w:sz w:val="20"/>
-                <w:szCs w:val="20"/>
-              </w:rPr>
-            </w:pPr>
-            <w:r>
-              <w:rPr>
-                <w:rFonts w:ascii="Calibri" w:eastAsia="Calibri" w:hAnsi="Calibri" w:cs="Calibri"/>
-                <w:sz w:val="20"/>
-                <w:szCs w:val="20"/>
+              </w:rPr>
+            </w:pPr>
+            <w:r>
+              <w:rPr>
+                <w:rFonts w:ascii="Calibri" w:eastAsia="Calibri" w:hAnsi="Calibri" w:cs="Calibri"/>
               </w:rPr>
               <w:t>Przygotowanie i przeprowadzenie pogłębionych wywiadów z udziałem testowych użytkowników,</w:t>
             </w:r>
@@ -2056,15 +2052,11 @@
               <w:jc w:val="both"/>
               <w:rPr>
                 <w:rFonts w:ascii="Calibri" w:eastAsia="Calibri" w:hAnsi="Calibri" w:cs="Calibri"/>
-                <w:sz w:val="20"/>
-                <w:szCs w:val="20"/>
-              </w:rPr>
-            </w:pPr>
-            <w:r>
-              <w:rPr>
-                <w:rFonts w:ascii="Calibri" w:eastAsia="Calibri" w:hAnsi="Calibri" w:cs="Calibri"/>
-                <w:sz w:val="20"/>
-                <w:szCs w:val="20"/>
+              </w:rPr>
+            </w:pPr>
+            <w:r>
+              <w:rPr>
+                <w:rFonts w:ascii="Calibri" w:eastAsia="Calibri" w:hAnsi="Calibri" w:cs="Calibri"/>
               </w:rPr>
               <w:t>Analiza wyników oraz wyciągnięcie wniosków,</w:t>
             </w:r>
@@ -2079,15 +2071,11 @@
               <w:jc w:val="both"/>
               <w:rPr>
                 <w:rFonts w:ascii="Calibri" w:eastAsia="Calibri" w:hAnsi="Calibri" w:cs="Calibri"/>
-                <w:sz w:val="20"/>
-                <w:szCs w:val="20"/>
-              </w:rPr>
-            </w:pPr>
-            <w:r>
-              <w:rPr>
-                <w:rFonts w:ascii="Calibri" w:eastAsia="Calibri" w:hAnsi="Calibri" w:cs="Calibri"/>
-                <w:sz w:val="20"/>
-                <w:szCs w:val="20"/>
+              </w:rPr>
+            </w:pPr>
+            <w:r>
+              <w:rPr>
+                <w:rFonts w:ascii="Calibri" w:eastAsia="Calibri" w:hAnsi="Calibri" w:cs="Calibri"/>
               </w:rPr>
               <w:t>Walidacja narzędzia psychometrycznego pomiaru potrzeb z wykorzystaniem obrazów (w tym porównanie z metodą referencyjną NEO-PI-R),</w:t>
             </w:r>
@@ -2102,15 +2090,11 @@
               <w:jc w:val="both"/>
               <w:rPr>
                 <w:rFonts w:ascii="Calibri" w:eastAsia="Calibri" w:hAnsi="Calibri" w:cs="Calibri"/>
-                <w:sz w:val="20"/>
-                <w:szCs w:val="20"/>
-              </w:rPr>
-            </w:pPr>
-            <w:r>
-              <w:rPr>
-                <w:rFonts w:ascii="Calibri" w:eastAsia="Calibri" w:hAnsi="Calibri" w:cs="Calibri"/>
-                <w:sz w:val="20"/>
-                <w:szCs w:val="20"/>
+              </w:rPr>
+            </w:pPr>
+            <w:r>
+              <w:rPr>
+                <w:rFonts w:ascii="Calibri" w:eastAsia="Calibri" w:hAnsi="Calibri" w:cs="Calibri"/>
               </w:rPr>
               <w:t>Określanie dodatkowych parametrów obrazów oraz walidacja reprezentatywnego modelu systemu.</w:t>
             </w:r>
@@ -2156,6 +2140,8 @@
               <w:left w:val="nil"/>
               <w:bottom w:val="single" w:sz="4" w:space="0" w:color="000000"/>
               <w:right w:val="single" w:sz="4" w:space="0" w:color="000000"/>
+              <w:tl2br w:val="single" w:sz="4" w:space="0" w:color="auto"/>
+              <w:tr2bl w:val="single" w:sz="4" w:space="0" w:color="auto"/>
             </w:tcBorders>
             <w:vAlign w:val="center"/>
           </w:tcPr>
@@ -2176,6 +2162,8 @@
               <w:left w:val="single" w:sz="4" w:space="0" w:color="000000"/>
               <w:bottom w:val="single" w:sz="4" w:space="0" w:color="000000"/>
               <w:right w:val="single" w:sz="4" w:space="0" w:color="000000"/>
+              <w:tl2br w:val="single" w:sz="4" w:space="0" w:color="auto"/>
+              <w:tr2bl w:val="single" w:sz="4" w:space="0" w:color="auto"/>
             </w:tcBorders>
             <w:vAlign w:val="center"/>
           </w:tcPr>
@@ -2196,6 +2184,8 @@
               <w:left w:val="nil"/>
               <w:bottom w:val="single" w:sz="4" w:space="0" w:color="000000"/>
               <w:right w:val="single" w:sz="4" w:space="0" w:color="000000"/>
+              <w:tl2br w:val="single" w:sz="4" w:space="0" w:color="auto"/>
+              <w:tr2bl w:val="single" w:sz="4" w:space="0" w:color="auto"/>
             </w:tcBorders>
             <w:vAlign w:val="center"/>
           </w:tcPr>
@@ -2847,15 +2837,11 @@
               <w:jc w:val="both"/>
               <w:rPr>
                 <w:rFonts w:ascii="Calibri" w:eastAsia="Calibri" w:hAnsi="Calibri" w:cs="Calibri"/>
-                <w:sz w:val="20"/>
-                <w:szCs w:val="20"/>
-              </w:rPr>
-            </w:pPr>
-            <w:r>
-              <w:rPr>
-                <w:rFonts w:ascii="Calibri" w:eastAsia="Calibri" w:hAnsi="Calibri" w:cs="Calibri"/>
-                <w:sz w:val="20"/>
-                <w:szCs w:val="20"/>
+              </w:rPr>
+            </w:pPr>
+            <w:r>
+              <w:rPr>
+                <w:rFonts w:ascii="Calibri" w:eastAsia="Calibri" w:hAnsi="Calibri" w:cs="Calibri"/>
               </w:rPr>
               <w:t>Przygotowanie i przeprowadzenie pogłębionych wywiadów z udziałem testowych użytkowników,</w:t>
             </w:r>
@@ -2870,15 +2856,11 @@
               <w:jc w:val="both"/>
               <w:rPr>
                 <w:rFonts w:ascii="Calibri" w:eastAsia="Calibri" w:hAnsi="Calibri" w:cs="Calibri"/>
-                <w:sz w:val="20"/>
-                <w:szCs w:val="20"/>
-              </w:rPr>
-            </w:pPr>
-            <w:r>
-              <w:rPr>
-                <w:rFonts w:ascii="Calibri" w:eastAsia="Calibri" w:hAnsi="Calibri" w:cs="Calibri"/>
-                <w:sz w:val="20"/>
-                <w:szCs w:val="20"/>
+              </w:rPr>
+            </w:pPr>
+            <w:r>
+              <w:rPr>
+                <w:rFonts w:ascii="Calibri" w:eastAsia="Calibri" w:hAnsi="Calibri" w:cs="Calibri"/>
               </w:rPr>
               <w:t>Analiza wyników oraz wyciągnięcie wniosków,</w:t>
             </w:r>
@@ -2893,15 +2875,11 @@
               <w:jc w:val="both"/>
               <w:rPr>
                 <w:rFonts w:ascii="Calibri" w:eastAsia="Calibri" w:hAnsi="Calibri" w:cs="Calibri"/>
-                <w:sz w:val="20"/>
-                <w:szCs w:val="20"/>
-              </w:rPr>
-            </w:pPr>
-            <w:r>
-              <w:rPr>
-                <w:rFonts w:ascii="Calibri" w:eastAsia="Calibri" w:hAnsi="Calibri" w:cs="Calibri"/>
-                <w:sz w:val="20"/>
-                <w:szCs w:val="20"/>
+              </w:rPr>
+            </w:pPr>
+            <w:r>
+              <w:rPr>
+                <w:rFonts w:ascii="Calibri" w:eastAsia="Calibri" w:hAnsi="Calibri" w:cs="Calibri"/>
               </w:rPr>
               <w:t>Walidacja narzędzia psychometrycznego pomiaru potrzeb z wykorzystaniem obrazów (w tym porównanie z metodą referencyjną NEO-PI-R),</w:t>
             </w:r>
@@ -2916,15 +2894,11 @@
               <w:jc w:val="both"/>
               <w:rPr>
                 <w:rFonts w:ascii="Calibri" w:eastAsia="Calibri" w:hAnsi="Calibri" w:cs="Calibri"/>
-                <w:sz w:val="20"/>
-                <w:szCs w:val="20"/>
-              </w:rPr>
-            </w:pPr>
-            <w:r>
-              <w:rPr>
-                <w:rFonts w:ascii="Calibri" w:eastAsia="Calibri" w:hAnsi="Calibri" w:cs="Calibri"/>
-                <w:sz w:val="20"/>
-                <w:szCs w:val="20"/>
+              </w:rPr>
+            </w:pPr>
+            <w:r>
+              <w:rPr>
+                <w:rFonts w:ascii="Calibri" w:eastAsia="Calibri" w:hAnsi="Calibri" w:cs="Calibri"/>
               </w:rPr>
               <w:t>Określanie dodatkowych parametrów obrazów oraz walidacja reprezentatywnego modelu systemu.</w:t>
             </w:r>
@@ -2970,6 +2944,8 @@
               <w:left w:val="nil"/>
               <w:bottom w:val="single" w:sz="4" w:space="0" w:color="000000"/>
               <w:right w:val="single" w:sz="4" w:space="0" w:color="000000"/>
+              <w:tl2br w:val="single" w:sz="4" w:space="0" w:color="auto"/>
+              <w:tr2bl w:val="single" w:sz="4" w:space="0" w:color="auto"/>
             </w:tcBorders>
             <w:vAlign w:val="center"/>
           </w:tcPr>
@@ -2990,6 +2966,8 @@
               <w:left w:val="single" w:sz="4" w:space="0" w:color="000000"/>
               <w:bottom w:val="single" w:sz="4" w:space="0" w:color="000000"/>
               <w:right w:val="single" w:sz="4" w:space="0" w:color="000000"/>
+              <w:tl2br w:val="single" w:sz="4" w:space="0" w:color="auto"/>
+              <w:tr2bl w:val="single" w:sz="4" w:space="0" w:color="auto"/>
             </w:tcBorders>
             <w:vAlign w:val="center"/>
           </w:tcPr>
@@ -3010,6 +2988,8 @@
               <w:left w:val="nil"/>
               <w:bottom w:val="single" w:sz="4" w:space="0" w:color="000000"/>
               <w:right w:val="single" w:sz="4" w:space="0" w:color="000000"/>
+              <w:tl2br w:val="single" w:sz="4" w:space="0" w:color="auto"/>
+              <w:tr2bl w:val="single" w:sz="4" w:space="0" w:color="auto"/>
             </w:tcBorders>
             <w:vAlign w:val="center"/>
           </w:tcPr>
@@ -3661,15 +3641,11 @@
               <w:jc w:val="both"/>
               <w:rPr>
                 <w:rFonts w:ascii="Calibri" w:eastAsia="Calibri" w:hAnsi="Calibri" w:cs="Calibri"/>
-                <w:sz w:val="20"/>
-                <w:szCs w:val="20"/>
-              </w:rPr>
-            </w:pPr>
-            <w:r>
-              <w:rPr>
-                <w:rFonts w:ascii="Calibri" w:eastAsia="Calibri" w:hAnsi="Calibri" w:cs="Calibri"/>
-                <w:sz w:val="20"/>
-                <w:szCs w:val="20"/>
+              </w:rPr>
+            </w:pPr>
+            <w:r>
+              <w:rPr>
+                <w:rFonts w:ascii="Calibri" w:eastAsia="Calibri" w:hAnsi="Calibri" w:cs="Calibri"/>
               </w:rPr>
               <w:t>Przygotowanie i przeprowadzenie pogłębionych wywiadów z udziałem testowych użytkowników,</w:t>
             </w:r>
@@ -3684,15 +3660,11 @@
               <w:jc w:val="both"/>
               <w:rPr>
                 <w:rFonts w:ascii="Calibri" w:eastAsia="Calibri" w:hAnsi="Calibri" w:cs="Calibri"/>
-                <w:sz w:val="20"/>
-                <w:szCs w:val="20"/>
-              </w:rPr>
-            </w:pPr>
-            <w:r>
-              <w:rPr>
-                <w:rFonts w:ascii="Calibri" w:eastAsia="Calibri" w:hAnsi="Calibri" w:cs="Calibri"/>
-                <w:sz w:val="20"/>
-                <w:szCs w:val="20"/>
+              </w:rPr>
+            </w:pPr>
+            <w:r>
+              <w:rPr>
+                <w:rFonts w:ascii="Calibri" w:eastAsia="Calibri" w:hAnsi="Calibri" w:cs="Calibri"/>
               </w:rPr>
               <w:t>Analiza wyników oraz wyciągnięcie wniosków,</w:t>
             </w:r>
@@ -3707,15 +3679,11 @@
               <w:jc w:val="both"/>
               <w:rPr>
                 <w:rFonts w:ascii="Calibri" w:eastAsia="Calibri" w:hAnsi="Calibri" w:cs="Calibri"/>
-                <w:sz w:val="20"/>
-                <w:szCs w:val="20"/>
-              </w:rPr>
-            </w:pPr>
-            <w:r>
-              <w:rPr>
-                <w:rFonts w:ascii="Calibri" w:eastAsia="Calibri" w:hAnsi="Calibri" w:cs="Calibri"/>
-                <w:sz w:val="20"/>
-                <w:szCs w:val="20"/>
+              </w:rPr>
+            </w:pPr>
+            <w:r>
+              <w:rPr>
+                <w:rFonts w:ascii="Calibri" w:eastAsia="Calibri" w:hAnsi="Calibri" w:cs="Calibri"/>
               </w:rPr>
               <w:t>Walidacja narzędzia psychometrycznego pomiaru potrzeb z wykorzystaniem obrazów (w tym porównanie z metodą referencyjną NEO-PI-R),</w:t>
             </w:r>
@@ -3730,15 +3698,11 @@
               <w:jc w:val="both"/>
               <w:rPr>
                 <w:rFonts w:ascii="Calibri" w:eastAsia="Calibri" w:hAnsi="Calibri" w:cs="Calibri"/>
-                <w:sz w:val="20"/>
-                <w:szCs w:val="20"/>
-              </w:rPr>
-            </w:pPr>
-            <w:r>
-              <w:rPr>
-                <w:rFonts w:ascii="Calibri" w:eastAsia="Calibri" w:hAnsi="Calibri" w:cs="Calibri"/>
-                <w:sz w:val="20"/>
-                <w:szCs w:val="20"/>
+              </w:rPr>
+            </w:pPr>
+            <w:r>
+              <w:rPr>
+                <w:rFonts w:ascii="Calibri" w:eastAsia="Calibri" w:hAnsi="Calibri" w:cs="Calibri"/>
               </w:rPr>
               <w:t>Określanie dodatkowych parametrów obrazów oraz walidacja reprezentatywnego modelu systemu.</w:t>
             </w:r>
@@ -3784,6 +3748,8 @@
               <w:left w:val="nil"/>
               <w:bottom w:val="single" w:sz="4" w:space="0" w:color="000000"/>
               <w:right w:val="single" w:sz="4" w:space="0" w:color="000000"/>
+              <w:tl2br w:val="single" w:sz="4" w:space="0" w:color="auto"/>
+              <w:tr2bl w:val="single" w:sz="4" w:space="0" w:color="auto"/>
             </w:tcBorders>
             <w:vAlign w:val="center"/>
           </w:tcPr>
@@ -3804,6 +3770,8 @@
               <w:left w:val="single" w:sz="4" w:space="0" w:color="000000"/>
               <w:bottom w:val="single" w:sz="4" w:space="0" w:color="000000"/>
               <w:right w:val="single" w:sz="4" w:space="0" w:color="000000"/>
+              <w:tl2br w:val="single" w:sz="4" w:space="0" w:color="auto"/>
+              <w:tr2bl w:val="single" w:sz="4" w:space="0" w:color="auto"/>
             </w:tcBorders>
             <w:vAlign w:val="center"/>
           </w:tcPr>
@@ -3824,6 +3792,8 @@
               <w:left w:val="nil"/>
               <w:bottom w:val="single" w:sz="4" w:space="0" w:color="000000"/>
               <w:right w:val="single" w:sz="4" w:space="0" w:color="000000"/>
+              <w:tl2br w:val="single" w:sz="4" w:space="0" w:color="auto"/>
+              <w:tr2bl w:val="single" w:sz="4" w:space="0" w:color="auto"/>
             </w:tcBorders>
             <w:vAlign w:val="center"/>
           </w:tcPr>
@@ -4475,15 +4445,11 @@
               <w:jc w:val="both"/>
               <w:rPr>
                 <w:rFonts w:ascii="Calibri" w:eastAsia="Calibri" w:hAnsi="Calibri" w:cs="Calibri"/>
-                <w:sz w:val="20"/>
-                <w:szCs w:val="20"/>
-              </w:rPr>
-            </w:pPr>
-            <w:r>
-              <w:rPr>
-                <w:rFonts w:ascii="Calibri" w:eastAsia="Calibri" w:hAnsi="Calibri" w:cs="Calibri"/>
-                <w:sz w:val="20"/>
-                <w:szCs w:val="20"/>
+              </w:rPr>
+            </w:pPr>
+            <w:r>
+              <w:rPr>
+                <w:rFonts w:ascii="Calibri" w:eastAsia="Calibri" w:hAnsi="Calibri" w:cs="Calibri"/>
               </w:rPr>
               <w:t>Przygotowanie i przeprowadzenie pogłębionych wywiadów z udziałem testowych użytkowników,</w:t>
             </w:r>
@@ -4498,15 +4464,11 @@
               <w:jc w:val="both"/>
               <w:rPr>
                 <w:rFonts w:ascii="Calibri" w:eastAsia="Calibri" w:hAnsi="Calibri" w:cs="Calibri"/>
-                <w:sz w:val="20"/>
-                <w:szCs w:val="20"/>
-              </w:rPr>
-            </w:pPr>
-            <w:r>
-              <w:rPr>
-                <w:rFonts w:ascii="Calibri" w:eastAsia="Calibri" w:hAnsi="Calibri" w:cs="Calibri"/>
-                <w:sz w:val="20"/>
-                <w:szCs w:val="20"/>
+              </w:rPr>
+            </w:pPr>
+            <w:r>
+              <w:rPr>
+                <w:rFonts w:ascii="Calibri" w:eastAsia="Calibri" w:hAnsi="Calibri" w:cs="Calibri"/>
               </w:rPr>
               <w:t>Analiza wyników oraz wyciągnięcie wniosków,</w:t>
             </w:r>
@@ -4521,15 +4483,11 @@
               <w:jc w:val="both"/>
               <w:rPr>
                 <w:rFonts w:ascii="Calibri" w:eastAsia="Calibri" w:hAnsi="Calibri" w:cs="Calibri"/>
-                <w:sz w:val="20"/>
-                <w:szCs w:val="20"/>
-              </w:rPr>
-            </w:pPr>
-            <w:r>
-              <w:rPr>
-                <w:rFonts w:ascii="Calibri" w:eastAsia="Calibri" w:hAnsi="Calibri" w:cs="Calibri"/>
-                <w:sz w:val="20"/>
-                <w:szCs w:val="20"/>
+              </w:rPr>
+            </w:pPr>
+            <w:r>
+              <w:rPr>
+                <w:rFonts w:ascii="Calibri" w:eastAsia="Calibri" w:hAnsi="Calibri" w:cs="Calibri"/>
               </w:rPr>
               <w:t>Walidacja narzędzia psychometrycznego pomiaru potrzeb z wykorzystaniem obrazów (w tym porównanie z metodą referencyjną NEO-PI-R),</w:t>
             </w:r>
@@ -4544,15 +4502,11 @@
               <w:jc w:val="both"/>
               <w:rPr>
                 <w:rFonts w:ascii="Calibri" w:eastAsia="Calibri" w:hAnsi="Calibri" w:cs="Calibri"/>
-                <w:sz w:val="20"/>
-                <w:szCs w:val="20"/>
-              </w:rPr>
-            </w:pPr>
-            <w:r>
-              <w:rPr>
-                <w:rFonts w:ascii="Calibri" w:eastAsia="Calibri" w:hAnsi="Calibri" w:cs="Calibri"/>
-                <w:sz w:val="20"/>
-                <w:szCs w:val="20"/>
+              </w:rPr>
+            </w:pPr>
+            <w:r>
+              <w:rPr>
+                <w:rFonts w:ascii="Calibri" w:eastAsia="Calibri" w:hAnsi="Calibri" w:cs="Calibri"/>
               </w:rPr>
               <w:t>Określanie dodatkowych parametrów obrazów oraz walidacja reprezentatywnego modelu systemu.</w:t>
             </w:r>
@@ -4598,6 +4552,8 @@
               <w:left w:val="nil"/>
               <w:bottom w:val="single" w:sz="4" w:space="0" w:color="000000"/>
               <w:right w:val="single" w:sz="4" w:space="0" w:color="000000"/>
+              <w:tl2br w:val="single" w:sz="4" w:space="0" w:color="auto"/>
+              <w:tr2bl w:val="single" w:sz="4" w:space="0" w:color="auto"/>
             </w:tcBorders>
             <w:vAlign w:val="center"/>
           </w:tcPr>
@@ -4618,6 +4574,8 @@
               <w:left w:val="single" w:sz="4" w:space="0" w:color="000000"/>
               <w:bottom w:val="single" w:sz="4" w:space="0" w:color="000000"/>
               <w:right w:val="single" w:sz="4" w:space="0" w:color="000000"/>
+              <w:tl2br w:val="single" w:sz="4" w:space="0" w:color="auto"/>
+              <w:tr2bl w:val="single" w:sz="4" w:space="0" w:color="auto"/>
             </w:tcBorders>
             <w:vAlign w:val="center"/>
           </w:tcPr>
@@ -4638,6 +4596,8 @@
               <w:left w:val="nil"/>
               <w:bottom w:val="single" w:sz="4" w:space="0" w:color="000000"/>
               <w:right w:val="single" w:sz="4" w:space="0" w:color="000000"/>
+              <w:tl2br w:val="single" w:sz="4" w:space="0" w:color="auto"/>
+              <w:tr2bl w:val="single" w:sz="4" w:space="0" w:color="auto"/>
             </w:tcBorders>
             <w:vAlign w:val="center"/>
           </w:tcPr>
@@ -5289,15 +5249,11 @@
               <w:jc w:val="both"/>
               <w:rPr>
                 <w:rFonts w:ascii="Calibri" w:eastAsia="Calibri" w:hAnsi="Calibri" w:cs="Calibri"/>
-                <w:sz w:val="20"/>
-                <w:szCs w:val="20"/>
-              </w:rPr>
-            </w:pPr>
-            <w:r>
-              <w:rPr>
-                <w:rFonts w:ascii="Calibri" w:eastAsia="Calibri" w:hAnsi="Calibri" w:cs="Calibri"/>
-                <w:sz w:val="20"/>
-                <w:szCs w:val="20"/>
+              </w:rPr>
+            </w:pPr>
+            <w:r>
+              <w:rPr>
+                <w:rFonts w:ascii="Calibri" w:eastAsia="Calibri" w:hAnsi="Calibri" w:cs="Calibri"/>
               </w:rPr>
               <w:t>Przygotowanie i przeprowadzenie pogłębionych wywiadów z udziałem testowych użytkowników,</w:t>
             </w:r>
@@ -5312,15 +5268,11 @@
               <w:jc w:val="both"/>
               <w:rPr>
                 <w:rFonts w:ascii="Calibri" w:eastAsia="Calibri" w:hAnsi="Calibri" w:cs="Calibri"/>
-                <w:sz w:val="20"/>
-                <w:szCs w:val="20"/>
-              </w:rPr>
-            </w:pPr>
-            <w:r>
-              <w:rPr>
-                <w:rFonts w:ascii="Calibri" w:eastAsia="Calibri" w:hAnsi="Calibri" w:cs="Calibri"/>
-                <w:sz w:val="20"/>
-                <w:szCs w:val="20"/>
+              </w:rPr>
+            </w:pPr>
+            <w:r>
+              <w:rPr>
+                <w:rFonts w:ascii="Calibri" w:eastAsia="Calibri" w:hAnsi="Calibri" w:cs="Calibri"/>
               </w:rPr>
               <w:t>Analiza wyników oraz wyciągnięcie wniosków,</w:t>
             </w:r>
@@ -5335,15 +5287,11 @@
               <w:jc w:val="both"/>
               <w:rPr>
                 <w:rFonts w:ascii="Calibri" w:eastAsia="Calibri" w:hAnsi="Calibri" w:cs="Calibri"/>
-                <w:sz w:val="20"/>
-                <w:szCs w:val="20"/>
-              </w:rPr>
-            </w:pPr>
-            <w:r>
-              <w:rPr>
-                <w:rFonts w:ascii="Calibri" w:eastAsia="Calibri" w:hAnsi="Calibri" w:cs="Calibri"/>
-                <w:sz w:val="20"/>
-                <w:szCs w:val="20"/>
+              </w:rPr>
+            </w:pPr>
+            <w:r>
+              <w:rPr>
+                <w:rFonts w:ascii="Calibri" w:eastAsia="Calibri" w:hAnsi="Calibri" w:cs="Calibri"/>
               </w:rPr>
               <w:t>Walidacja narzędzia psychometrycznego pomiaru potrzeb z wykorzystaniem obrazów (w tym porównanie z metodą referencyjną NEO-PI-R),</w:t>
             </w:r>
@@ -5358,15 +5306,11 @@
               <w:jc w:val="both"/>
               <w:rPr>
                 <w:rFonts w:ascii="Calibri" w:eastAsia="Calibri" w:hAnsi="Calibri" w:cs="Calibri"/>
-                <w:sz w:val="20"/>
-                <w:szCs w:val="20"/>
-              </w:rPr>
-            </w:pPr>
-            <w:r>
-              <w:rPr>
-                <w:rFonts w:ascii="Calibri" w:eastAsia="Calibri" w:hAnsi="Calibri" w:cs="Calibri"/>
-                <w:sz w:val="20"/>
-                <w:szCs w:val="20"/>
+              </w:rPr>
+            </w:pPr>
+            <w:r>
+              <w:rPr>
+                <w:rFonts w:ascii="Calibri" w:eastAsia="Calibri" w:hAnsi="Calibri" w:cs="Calibri"/>
               </w:rPr>
               <w:t>Określanie dodatkowych parametrów obrazów oraz walidacja reprezentatywnego modelu systemu.</w:t>
             </w:r>
@@ -5412,6 +5356,8 @@
               <w:left w:val="nil"/>
               <w:bottom w:val="single" w:sz="4" w:space="0" w:color="000000"/>
               <w:right w:val="single" w:sz="4" w:space="0" w:color="000000"/>
+              <w:tl2br w:val="single" w:sz="4" w:space="0" w:color="auto"/>
+              <w:tr2bl w:val="single" w:sz="4" w:space="0" w:color="auto"/>
             </w:tcBorders>
             <w:vAlign w:val="center"/>
           </w:tcPr>
@@ -5432,6 +5378,8 @@
               <w:left w:val="single" w:sz="4" w:space="0" w:color="000000"/>
               <w:bottom w:val="single" w:sz="4" w:space="0" w:color="000000"/>
               <w:right w:val="single" w:sz="4" w:space="0" w:color="000000"/>
+              <w:tl2br w:val="single" w:sz="4" w:space="0" w:color="auto"/>
+              <w:tr2bl w:val="single" w:sz="4" w:space="0" w:color="auto"/>
             </w:tcBorders>
             <w:vAlign w:val="center"/>
           </w:tcPr>
@@ -5452,6 +5400,8 @@
               <w:left w:val="nil"/>
               <w:bottom w:val="single" w:sz="4" w:space="0" w:color="000000"/>
               <w:right w:val="single" w:sz="4" w:space="0" w:color="000000"/>
+              <w:tl2br w:val="single" w:sz="4" w:space="0" w:color="auto"/>
+              <w:tr2bl w:val="single" w:sz="4" w:space="0" w:color="auto"/>
             </w:tcBorders>
             <w:vAlign w:val="center"/>
           </w:tcPr>
@@ -6103,15 +6053,11 @@
               <w:jc w:val="both"/>
               <w:rPr>
                 <w:rFonts w:ascii="Calibri" w:eastAsia="Calibri" w:hAnsi="Calibri" w:cs="Calibri"/>
-                <w:sz w:val="20"/>
-                <w:szCs w:val="20"/>
-              </w:rPr>
-            </w:pPr>
-            <w:r>
-              <w:rPr>
-                <w:rFonts w:ascii="Calibri" w:eastAsia="Calibri" w:hAnsi="Calibri" w:cs="Calibri"/>
-                <w:sz w:val="20"/>
-                <w:szCs w:val="20"/>
+              </w:rPr>
+            </w:pPr>
+            <w:r>
+              <w:rPr>
+                <w:rFonts w:ascii="Calibri" w:eastAsia="Calibri" w:hAnsi="Calibri" w:cs="Calibri"/>
               </w:rPr>
               <w:t>Przygotowanie i przeprowadzenie pogłębionych wywiadów z udziałem testowych użytkowników,</w:t>
             </w:r>
@@ -6126,15 +6072,11 @@
               <w:jc w:val="both"/>
               <w:rPr>
                 <w:rFonts w:ascii="Calibri" w:eastAsia="Calibri" w:hAnsi="Calibri" w:cs="Calibri"/>
-                <w:sz w:val="20"/>
-                <w:szCs w:val="20"/>
-              </w:rPr>
-            </w:pPr>
-            <w:r>
-              <w:rPr>
-                <w:rFonts w:ascii="Calibri" w:eastAsia="Calibri" w:hAnsi="Calibri" w:cs="Calibri"/>
-                <w:sz w:val="20"/>
-                <w:szCs w:val="20"/>
+              </w:rPr>
+            </w:pPr>
+            <w:r>
+              <w:rPr>
+                <w:rFonts w:ascii="Calibri" w:eastAsia="Calibri" w:hAnsi="Calibri" w:cs="Calibri"/>
               </w:rPr>
               <w:t>Analiza wyników oraz wyciągnięcie wniosków,</w:t>
             </w:r>
@@ -6149,15 +6091,11 @@
               <w:jc w:val="both"/>
               <w:rPr>
                 <w:rFonts w:ascii="Calibri" w:eastAsia="Calibri" w:hAnsi="Calibri" w:cs="Calibri"/>
-                <w:sz w:val="20"/>
-                <w:szCs w:val="20"/>
-              </w:rPr>
-            </w:pPr>
-            <w:r>
-              <w:rPr>
-                <w:rFonts w:ascii="Calibri" w:eastAsia="Calibri" w:hAnsi="Calibri" w:cs="Calibri"/>
-                <w:sz w:val="20"/>
-                <w:szCs w:val="20"/>
+              </w:rPr>
+            </w:pPr>
+            <w:r>
+              <w:rPr>
+                <w:rFonts w:ascii="Calibri" w:eastAsia="Calibri" w:hAnsi="Calibri" w:cs="Calibri"/>
               </w:rPr>
               <w:t>Walidacja narzędzia psychometrycznego pomiaru potrzeb z wykorzystaniem obrazów (w tym porównanie z metodą referencyjną NEO-PI-R),</w:t>
             </w:r>
@@ -6172,15 +6110,11 @@
               <w:jc w:val="both"/>
               <w:rPr>
                 <w:rFonts w:ascii="Calibri" w:eastAsia="Calibri" w:hAnsi="Calibri" w:cs="Calibri"/>
-                <w:sz w:val="20"/>
-                <w:szCs w:val="20"/>
-              </w:rPr>
-            </w:pPr>
-            <w:r>
-              <w:rPr>
-                <w:rFonts w:ascii="Calibri" w:eastAsia="Calibri" w:hAnsi="Calibri" w:cs="Calibri"/>
-                <w:sz w:val="20"/>
-                <w:szCs w:val="20"/>
+              </w:rPr>
+            </w:pPr>
+            <w:r>
+              <w:rPr>
+                <w:rFonts w:ascii="Calibri" w:eastAsia="Calibri" w:hAnsi="Calibri" w:cs="Calibri"/>
               </w:rPr>
               <w:t>Określanie dodatkowych parametrów obrazów oraz walidacja reprezentatywnego modelu systemu.</w:t>
             </w:r>
@@ -6226,6 +6160,8 @@
               <w:left w:val="nil"/>
               <w:bottom w:val="single" w:sz="4" w:space="0" w:color="000000"/>
               <w:right w:val="single" w:sz="4" w:space="0" w:color="000000"/>
+              <w:tl2br w:val="single" w:sz="4" w:space="0" w:color="auto"/>
+              <w:tr2bl w:val="single" w:sz="4" w:space="0" w:color="auto"/>
             </w:tcBorders>
             <w:vAlign w:val="center"/>
           </w:tcPr>
@@ -6246,6 +6182,8 @@
               <w:left w:val="single" w:sz="4" w:space="0" w:color="000000"/>
               <w:bottom w:val="single" w:sz="4" w:space="0" w:color="000000"/>
               <w:right w:val="single" w:sz="4" w:space="0" w:color="000000"/>
+              <w:tl2br w:val="single" w:sz="4" w:space="0" w:color="auto"/>
+              <w:tr2bl w:val="single" w:sz="4" w:space="0" w:color="auto"/>
             </w:tcBorders>
             <w:vAlign w:val="center"/>
           </w:tcPr>
@@ -6266,6 +6204,8 @@
               <w:left w:val="nil"/>
               <w:bottom w:val="single" w:sz="4" w:space="0" w:color="000000"/>
               <w:right w:val="single" w:sz="4" w:space="0" w:color="000000"/>
+              <w:tl2br w:val="single" w:sz="4" w:space="0" w:color="auto"/>
+              <w:tr2bl w:val="single" w:sz="4" w:space="0" w:color="auto"/>
             </w:tcBorders>
             <w:vAlign w:val="center"/>
           </w:tcPr>

</xml_diff>